<commit_message>
ARK-455b v1.0: execution complete — VERDICT PASS
Kill-gate PASS (100% V1-V2 concordance, sanity + mutation-effectiveness OK).
All 9 arms x 100 records executed. Results:
- C1 V_accept_original = 1.0000 (>=0.95)
- C2 V_reject_min       = 1.0000 (>=0.95, min over arms 2-9)
- C3 V_margin           = 1.0000 (>=0.85)
- Overall V1-V2 concordance: 900/900 = 100.00%
- Mutation-effectiveness: 800/800 on REJECT arms

Corrected Arm 3 (real timestamp tamper) detected 100% -> confirms the ARK-455
FAIL was a harness no-op, not a verifier/spec defect. New Arm 9 (pre-signing
expired, valid signature) rejected 100% via validity-window gate.

Also updated ark-455/CORRECTION.md with the confirming ARK-455b outcome.
</commit_message>
<xml_diff>
--- a/ark-455/CORRECTION.docx
+++ b/ark-455/CORRECTION.docx
@@ -1322,6 +1322,80 @@
       </w:r>
       <w:r>
         <w:t xml:space="preserve">detection failure.</w:t>
+      </w:r>
+    </w:p>
+    <w:p>
+      <w:pPr>
+        <w:numPr>
+          <w:ilvl w:val="0"/>
+          <w:numId w:val="1000"/>
+        </w:numPr>
+        <w:pStyle w:val="Compact"/>
+      </w:pPr>
+      <w:r>
+        <w:rPr>
+          <w:bCs/>
+          <w:b/>
+        </w:rPr>
+        <w:t xml:space="preserve">ARK-455b outcome (2026-07-17): PASS.</w:t>
+      </w:r>
+      <w:r>
+        <w:t xml:space="preserve"> </w:t>
+      </w:r>
+      <w:r>
+        <w:t xml:space="preserve">With the corrected mutation, Arm 3</w:t>
+      </w:r>
+      <w:r>
+        <w:t xml:space="preserve"> </w:t>
+      </w:r>
+      <w:r>
+        <w:t xml:space="preserve">(timestamp) is now detected at</w:t>
+      </w:r>
+      <w:r>
+        <w:t xml:space="preserve"> </w:t>
+      </w:r>
+      <w:r>
+        <w:rPr>
+          <w:bCs/>
+          <w:b/>
+        </w:rPr>
+        <w:t xml:space="preserve">100%</w:t>
+      </w:r>
+      <w:r>
+        <w:t xml:space="preserve"> </w:t>
+      </w:r>
+      <w:r>
+        <w:t xml:space="preserve">by both verifiers, empirically confirming</w:t>
+      </w:r>
+      <w:r>
+        <w:t xml:space="preserve"> </w:t>
+      </w:r>
+      <w:r>
+        <w:t xml:space="preserve">this erratum’s root-cause finding. The new pre-signing expired-timestamp arm is</w:t>
+      </w:r>
+      <w:r>
+        <w:t xml:space="preserve"> </w:t>
+      </w:r>
+      <w:r>
+        <w:t xml:space="preserve">also rejected at 100% via the validity-window gate, and V1–V2 concordance is</w:t>
+      </w:r>
+      <w:r>
+        <w:t xml:space="preserve"> </w:t>
+      </w:r>
+      <w:r>
+        <w:t xml:space="preserve">100% across all 900 records. See</w:t>
+      </w:r>
+      <w:r>
+        <w:t xml:space="preserve"> </w:t>
+      </w:r>
+      <w:r>
+        <w:rPr>
+          <w:rStyle w:val="VerbatimChar"/>
+        </w:rPr>
+        <w:t xml:space="preserve">../ark-455b/RESULTS.md</w:t>
+      </w:r>
+      <w:r>
+        <w:t xml:space="preserve">.</w:t>
       </w:r>
     </w:p>
     <w:p>

</xml_diff>